<commit_message>
Release 1.22.0 — Bank Guarantee EMD/ASD automation, tolerant Works List circle import, accurate previews
- Agreement/Work Order: EMD Details can now be filled from either an uploaded
  CURE Balance EMD receipt or a Bank Guarantee certificate, matching BG
  amounts to EMD/ASD from the work's ECV.
- Works List import now tolerates rows from a different (merged/reorganised)
  circle instead of rejecting the whole list, with a confirmation prompt when
  over 20% of rows are foreign.
- Added the Serilingampally (SLP) zone abbreviation.
- Document previews are accurate (LibreOffice-rasterized) for single-document
  view and Print, while tile-grid/live previews stay fast.
- SE zonal document templates (Agreement Bond, Agreement Note, Concluding
  Agreement, Memo to EE, Work Order) rebuilt/corrected; Contract Deed
  template removed (superseded, no longer referenced).

Co-Authored-By: Claude Sonnet 5 <noreply@anthropic.com>
</commit_message>
<xml_diff>
--- a/resources/zonal-concluding-agreement-template.docx
+++ b/resources/zonal-concluding-agreement-template.docx
@@ -231,7 +231,7 @@
           <w:bCs/>
           <w:u w:val="single"/>
         </w:rPr>
-        <w:t xml:space="preserve">Memo No.     /SE/{{ZoneAbbr}}/{{Corp}}/{{FY}}                                   Dated:                    -2026 </w:t>
+        <w:t xml:space="preserve">Memo No.     /SE/{{ZoneAbbr}}/{{Corp}}/{{FY}}                                   Dated:                    -{{Agmt Year}} </w:t>
       </w:r>
     </w:p>
     <w:p>
@@ -283,7 +283,48 @@
         <w:rPr>
           <w:rFonts w:cs="Book Antiqua" w:ascii="Book Antiqua" w:hAnsi="Book Antiqua"/>
         </w:rPr>
-        <w:t xml:space="preserve">Sub:-  Engg – SE – {{ZoneAbbr}} - {{Corp}} – “{{Name of Work}}” – Concluding agreement – Communicated - Reg.</w:t>
+        <w:t xml:space="preserve">Sub:-  </w:t>
+      </w:r>
+      <w:r>
+        <w:rPr>
+          <w:rFonts w:cs="Book Antiqua" w:ascii="Book Antiqua" w:hAnsi="Book Antiqua"/>
+          <w:sz w:val="22"/>
+          <w:szCs w:val="22"/>
+        </w:rPr>
+        <w:t xml:space="preserve">Engg – SE – {{ZoneAbbr}} - {{Corp}} </w:t>
+      </w:r>
+      <w:r>
+        <w:rPr>
+          <w:rFonts w:cs="Book Antiqua" w:ascii="Book Antiqua" w:hAnsi="Book Antiqua"/>
+        </w:rPr>
+        <w:t xml:space="preserve">– </w:t>
+      </w:r>
+      <w:r>
+        <w:rPr>
+          <w:rFonts w:cs="Book Antiqua" w:ascii="Book Antiqua" w:hAnsi="Book Antiqua"/>
+          <w:sz w:val="22"/>
+          <w:szCs w:val="22"/>
+        </w:rPr>
+        <w:t>“</w:t>
+      </w:r>
+      <w:r>
+        <w:rPr/>
+        <w:t>{{Name of Work}}</w:t>
+      </w:r>
+      <w:r>
+        <w:rPr>
+          <w:sz w:val="22"/>
+          <w:szCs w:val="22"/>
+        </w:rPr>
+        <w:t xml:space="preserve">” </w:t>
+      </w:r>
+      <w:r>
+        <w:rPr>
+          <w:rFonts w:cs="Book Antiqua" w:ascii="Book Antiqua" w:hAnsi="Book Antiqua"/>
+          <w:sz w:val="20"/>
+          <w:szCs w:val="20"/>
+        </w:rPr>
+        <w:t>– Concluding agreement – Communicated - Reg.</w:t>
       </w:r>
     </w:p>
     <w:p>
@@ -322,7 +363,22 @@
           <w:rFonts w:cs="Book Antiqua" w:ascii="Book Antiqua" w:hAnsi="Book Antiqua"/>
           <w:bCs w:val="false"/>
         </w:rPr>
-        <w:t xml:space="preserve">   Ref:-  Agmt. No.         /SE/{{ZoneAbbr}}/{{Corp}}/{{FY}}                Date :                 -2026</w:t>
+        <w:t xml:space="preserve">   </w:t>
+      </w:r>
+      <w:r>
+        <w:rPr>
+          <w:rFonts w:cs="Book Antiqua" w:ascii="Book Antiqua" w:hAnsi="Book Antiqua"/>
+          <w:bCs w:val="false"/>
+        </w:rPr>
+        <w:t>Ref:-</w:t>
+      </w:r>
+      <w:r>
+        <w:rPr>
+          <w:rFonts w:cs="Book Antiqua" w:ascii="Book Antiqua" w:hAnsi="Book Antiqua"/>
+          <w:b w:val="false"/>
+          <w:bCs w:val="false"/>
+        </w:rPr>
+        <w:t xml:space="preserve">  Agmt. No.         /SE/{{ZoneAbbr}}/{{Corp}}/{{FY}}                Date :                 -{{Agmt Year}}</w:t>
       </w:r>
     </w:p>
     <w:p>
@@ -355,25 +411,40 @@
           <w:rFonts w:cs="Book Antiqua" w:ascii="Book Antiqua" w:hAnsi="Book Antiqua"/>
         </w:rPr>
         <w:tab/>
-        <w:t xml:space="preserve">  In continuation to the Agreement under reference cited the following ORIGINAL DOCUMENTS are forwarded to the Executive Engineer, {{EE Circle}}, {{Zone}} Zone, {{Corp}} for further necessary action. The copies of Administrative sanction, Estimate and Contract Approval are also forwarded for reference.</w:t>
-      </w:r>
-    </w:p>
-    <w:p>
-      <w:pPr>
-        <w:pStyle w:val="Normal"/>
-        <w:jc w:val="both"/>
-        <w:rPr>
-          <w:rFonts w:ascii="Book Antiqua" w:hAnsi="Book Antiqua" w:cs="Book Antiqua"/>
+      </w:r>
+      <w:r>
+        <w:rPr>
+          <w:rFonts w:cs="Book Antiqua" w:ascii="Book Antiqua" w:hAnsi="Book Antiqua"/>
           <w:sz w:val="20"/>
           <w:szCs w:val="20"/>
         </w:rPr>
-      </w:pPr>
-      <w:r>
-        <w:rPr>
-          <w:rFonts w:cs="Book Antiqua" w:ascii="Book Antiqua" w:hAnsi="Book Antiqua"/>
+        <w:t xml:space="preserve">  </w:t>
+      </w:r>
+      <w:r>
+        <w:rPr>
+          <w:rFonts w:cs="Book Antiqua" w:ascii="Book Antiqua" w:hAnsi="Book Antiqua"/>
+          <w:sz w:val="22"/>
+          <w:szCs w:val="22"/>
+        </w:rPr>
+        <w:t>In continuation to the Agreement under reference cited the following ORIGINAL DOCUMENTS are forwarded to the Executive Engineer, {{EE Circle}}, {{Zone}} Zone, {{Corp}} for further necessary action. The copies of Administrative sanction, Estimate and Contract Approval are also forwarded for reference.</w:t>
+      </w:r>
+    </w:p>
+    <w:p>
+      <w:pPr>
+        <w:pStyle w:val="Normal"/>
+        <w:jc w:val="both"/>
+        <w:rPr>
+          <w:rFonts w:ascii="Book Antiqua" w:hAnsi="Book Antiqua" w:cs="Book Antiqua"/>
           <w:sz w:val="20"/>
           <w:szCs w:val="20"/>
         </w:rPr>
+      </w:pPr>
+      <w:r>
+        <w:rPr>
+          <w:rFonts w:cs="Book Antiqua" w:ascii="Book Antiqua" w:hAnsi="Book Antiqua"/>
+          <w:sz w:val="20"/>
+          <w:szCs w:val="20"/>
+        </w:rPr>
       </w:r>
     </w:p>
     <w:p>
@@ -393,6 +464,672 @@
         </w:rPr>
       </w:r>
     </w:p>
+    <w:tbl>
+      <w:tblPr>
+        <w:tblW w:w="9647" w:type="dxa"/>
+        <w:tblInd w:w="108" w:type="dxa"/>
+        <w:tblLook w:val="04A0" w:firstRow="1" w:lastRow="0" w:firstColumn="1" w:lastColumn="0" w:noHBand="0" w:noVBand="1"/>
+      </w:tblPr>
+      <w:tblGrid>
+        <w:gridCol w:w="378"/>
+        <w:gridCol w:w="4075"/>
+        <w:gridCol w:w="358"/>
+        <w:gridCol w:w="4836"/>
+      </w:tblGrid>
+      <w:tr>
+        <w:trPr>
+          <w:trHeight w:val="327"/>
+        </w:trPr>
+        <w:tc>
+          <w:tcPr>
+            <w:tcW w:w="378" w:type="dxa"/>
+            <w:tcBorders>
+              <w:top w:val="nil"/>
+              <w:left w:val="nil"/>
+              <w:bottom w:val="nil"/>
+              <w:right w:val="nil"/>
+            </w:tcBorders>
+            <w:noWrap/>
+            <w:hideMark/>
+          </w:tcPr>
+          <w:p>
+            <w:pPr>
+              <w:suppressAutoHyphens w:val="0"/>
+              <w:jc w:val="right"/>
+              <w:rPr>
+                <w:rFonts w:ascii="Aptos Narrow" w:hAnsi="Aptos Narrow"/>
+                <w:color w:val="000000"/>
+                <w:lang w:val="en-IN" w:eastAsia="en-GB"/>
+              </w:rPr>
+            </w:pPr>
+            <w:r>
+              <w:rPr>
+                <w:rFonts w:ascii="Aptos Narrow" w:hAnsi="Aptos Narrow"/>
+                <w:color w:val="000000"/>
+                <w:lang w:val="en-IN" w:eastAsia="en-GB"/>
+              </w:rPr>
+              <w:t>1</w:t>
+            </w:r>
+          </w:p>
+        </w:tc>
+        <w:tc>
+          <w:tcPr>
+            <w:tcW w:w="4075" w:type="dxa"/>
+            <w:tcBorders>
+              <w:top w:val="nil"/>
+              <w:left w:val="nil"/>
+              <w:bottom w:val="nil"/>
+              <w:right w:val="nil"/>
+            </w:tcBorders>
+            <w:noWrap/>
+            <w:hideMark/>
+          </w:tcPr>
+          <w:p>
+            <w:pPr>
+              <w:suppressAutoHyphens w:val="0"/>
+              <w:rPr>
+                <w:rFonts w:ascii="Aptos Narrow" w:hAnsi="Aptos Narrow"/>
+                <w:color w:val="000000"/>
+                <w:lang w:val="en-IN" w:eastAsia="en-GB"/>
+              </w:rPr>
+            </w:pPr>
+            <w:r>
+              <w:rPr>
+                <w:rFonts w:ascii="Aptos Narrow" w:hAnsi="Aptos Narrow"/>
+                <w:color w:val="000000"/>
+                <w:lang w:val="en-IN" w:eastAsia="en-GB"/>
+              </w:rPr>
+              <w:t>Original Agreement Bond No.</w:t>
+            </w:r>
+          </w:p>
+        </w:tc>
+        <w:tc>
+          <w:tcPr>
+            <w:tcW w:w="358" w:type="dxa"/>
+            <w:tcBorders>
+              <w:top w:val="nil"/>
+              <w:left w:val="nil"/>
+              <w:bottom w:val="nil"/>
+              <w:right w:val="nil"/>
+            </w:tcBorders>
+            <w:noWrap/>
+            <w:hideMark/>
+          </w:tcPr>
+          <w:p>
+            <w:pPr>
+              <w:suppressAutoHyphens w:val="0"/>
+              <w:rPr>
+                <w:rFonts w:ascii="Aptos Narrow" w:hAnsi="Aptos Narrow"/>
+                <w:color w:val="000000"/>
+                <w:lang w:val="en-IN" w:eastAsia="en-GB"/>
+              </w:rPr>
+            </w:pPr>
+            <w:r>
+              <w:rPr>
+                <w:rFonts w:ascii="Aptos Narrow" w:hAnsi="Aptos Narrow"/>
+                <w:color w:val="000000"/>
+                <w:lang w:val="en-IN" w:eastAsia="en-GB"/>
+              </w:rPr>
+              <w:t>:</w:t>
+            </w:r>
+          </w:p>
+        </w:tc>
+        <w:tc>
+          <w:tcPr>
+            <w:tcW w:w="4836" w:type="dxa"/>
+            <w:tcBorders>
+              <w:top w:val="nil"/>
+              <w:left w:val="nil"/>
+              <w:bottom w:val="nil"/>
+              <w:right w:val="nil"/>
+            </w:tcBorders>
+            <w:noWrap/>
+            <w:hideMark/>
+          </w:tcPr>
+          <w:p>
+            <w:pPr>
+              <w:suppressAutoHyphens w:val="0"/>
+              <w:rPr>
+                <w:rFonts w:ascii="Aptos Narrow" w:hAnsi="Aptos Narrow"/>
+                <w:color w:val="000000"/>
+                <w:lang w:val="en-IN" w:eastAsia="en-GB"/>
+              </w:rPr>
+            </w:pPr>
+            <w:r>
+              <w:rPr>
+                <w:rFonts w:ascii="Aptos Narrow" w:hAnsi="Aptos Narrow"/>
+                <w:color w:val="000000"/>
+                <w:lang w:val="en-IN" w:eastAsia="en-GB"/>
+              </w:rPr>
+              <w:t xml:space="preserve">      /SE/{{ZoneAbbr}}/{{Corp}}/{{FY}}/  Date :          -{{Agmt Year}} </w:t>
+            </w:r>
+          </w:p>
+        </w:tc>
+      </w:tr>
+      <w:tr>
+        <w:trPr>
+          <w:trHeight w:val="1678"/>
+        </w:trPr>
+        <w:tc>
+          <w:tcPr>
+            <w:tcW w:w="378" w:type="dxa"/>
+            <w:tcBorders>
+              <w:top w:val="nil"/>
+              <w:left w:val="nil"/>
+              <w:bottom w:val="nil"/>
+              <w:right w:val="nil"/>
+            </w:tcBorders>
+            <w:noWrap/>
+            <w:hideMark/>
+          </w:tcPr>
+          <w:p>
+            <w:pPr>
+              <w:suppressAutoHyphens w:val="0"/>
+              <w:jc w:val="right"/>
+              <w:rPr>
+                <w:rFonts w:ascii="Aptos Narrow" w:hAnsi="Aptos Narrow"/>
+                <w:color w:val="000000"/>
+                <w:lang w:val="en-IN" w:eastAsia="en-GB"/>
+              </w:rPr>
+            </w:pPr>
+            <w:r>
+              <w:rPr>
+                <w:rFonts w:ascii="Aptos Narrow" w:hAnsi="Aptos Narrow"/>
+                <w:color w:val="000000"/>
+                <w:lang w:val="en-IN" w:eastAsia="en-GB"/>
+              </w:rPr>
+              <w:t>2</w:t>
+            </w:r>
+          </w:p>
+        </w:tc>
+        <w:tc>
+          <w:tcPr>
+            <w:tcW w:w="4075" w:type="dxa"/>
+            <w:tcBorders>
+              <w:top w:val="nil"/>
+              <w:left w:val="nil"/>
+              <w:bottom w:val="nil"/>
+              <w:right w:val="nil"/>
+            </w:tcBorders>
+            <w:noWrap/>
+            <w:hideMark/>
+          </w:tcPr>
+          <w:p>
+            <w:pPr>
+              <w:suppressAutoHyphens w:val="0"/>
+              <w:rPr>
+                <w:rFonts w:ascii="Aptos Narrow" w:hAnsi="Aptos Narrow"/>
+                <w:color w:val="000000"/>
+                <w:lang w:val="en-IN" w:eastAsia="en-GB"/>
+              </w:rPr>
+            </w:pPr>
+            <w:r>
+              <w:rPr>
+                <w:rFonts w:ascii="Aptos Narrow" w:hAnsi="Aptos Narrow"/>
+                <w:color w:val="000000"/>
+                <w:lang w:val="en-IN" w:eastAsia="en-GB"/>
+              </w:rPr>
+              <w:t xml:space="preserve">Original Agreement Bond of    </w:t>
+            </w:r>
+          </w:p>
+        </w:tc>
+        <w:tc>
+          <w:tcPr>
+            <w:tcW w:w="358" w:type="dxa"/>
+            <w:tcBorders>
+              <w:top w:val="nil"/>
+              <w:left w:val="nil"/>
+              <w:bottom w:val="nil"/>
+              <w:right w:val="nil"/>
+            </w:tcBorders>
+            <w:noWrap/>
+            <w:hideMark/>
+          </w:tcPr>
+          <w:p>
+            <w:pPr>
+              <w:suppressAutoHyphens w:val="0"/>
+              <w:rPr>
+                <w:rFonts w:ascii="Aptos Narrow" w:hAnsi="Aptos Narrow"/>
+                <w:color w:val="000000"/>
+                <w:lang w:val="en-IN" w:eastAsia="en-GB"/>
+              </w:rPr>
+            </w:pPr>
+            <w:r>
+              <w:rPr>
+                <w:rFonts w:ascii="Aptos Narrow" w:hAnsi="Aptos Narrow"/>
+                <w:color w:val="000000"/>
+                <w:lang w:val="en-IN" w:eastAsia="en-GB"/>
+              </w:rPr>
+              <w:t>:</w:t>
+            </w:r>
+          </w:p>
+        </w:tc>
+        <w:tc>
+          <w:tcPr>
+            <w:tcW w:w="4836" w:type="dxa"/>
+            <w:tcBorders>
+              <w:top w:val="nil"/>
+              <w:left w:val="nil"/>
+              <w:bottom w:val="nil"/>
+              <w:right w:val="nil"/>
+            </w:tcBorders>
+            <w:hideMark/>
+          </w:tcPr>
+          <w:p>
+            <w:pPr>
+              <w:suppressAutoHyphens w:val="0"/>
+              <w:rPr>
+                <w:rFonts w:ascii="Aptos Narrow" w:hAnsi="Aptos Narrow"/>
+                <w:color w:val="000000"/>
+                <w:lang w:val="en-IN" w:eastAsia="en-GB"/>
+              </w:rPr>
+            </w:pPr>
+            <w:r>
+              <w:rPr>
+                <w:rFonts w:ascii="Aptos Narrow" w:hAnsi="Aptos Narrow"/>
+                <w:color w:val="000000"/>
+                <w:lang w:val="en-IN" w:eastAsia="en-GB"/>
+              </w:rPr>
+              <w:t>Sri.{{Agency Name}},</w:t>
+            </w:r>
+            <w:r>
+              <w:rPr>
+                <w:rFonts w:ascii="Aptos Narrow" w:hAnsi="Aptos Narrow"/>
+                <w:color w:val="000000"/>
+                <w:lang w:val="en-IN" w:eastAsia="en-GB"/>
+              </w:rPr>
+              <w:br/>
+              <w:t>{{Agency Address}}</w:t>
+            </w:r>
+          </w:p>
+        </w:tc>
+      </w:tr>
+      <w:tr>
+        <w:trPr>
+          <w:trHeight w:val="696"/>
+        </w:trPr>
+        <w:tc>
+          <w:tcPr>
+            <w:tcW w:w="378" w:type="dxa"/>
+            <w:tcBorders>
+              <w:top w:val="nil"/>
+              <w:left w:val="nil"/>
+              <w:bottom w:val="nil"/>
+              <w:right w:val="nil"/>
+            </w:tcBorders>
+            <w:noWrap/>
+            <w:hideMark/>
+          </w:tcPr>
+          <w:p>
+            <w:pPr>
+              <w:suppressAutoHyphens w:val="0"/>
+              <w:jc w:val="right"/>
+              <w:rPr>
+                <w:rFonts w:ascii="Aptos Narrow" w:hAnsi="Aptos Narrow"/>
+                <w:color w:val="000000"/>
+                <w:lang w:val="en-IN" w:eastAsia="en-GB"/>
+              </w:rPr>
+            </w:pPr>
+            <w:r>
+              <w:rPr>
+                <w:rFonts w:ascii="Aptos Narrow" w:hAnsi="Aptos Narrow"/>
+                <w:color w:val="000000"/>
+                <w:lang w:val="en-IN" w:eastAsia="en-GB"/>
+              </w:rPr>
+              <w:t>3</w:t>
+            </w:r>
+          </w:p>
+        </w:tc>
+        <w:tc>
+          <w:tcPr>
+            <w:tcW w:w="4075" w:type="dxa"/>
+            <w:tcBorders>
+              <w:top w:val="nil"/>
+              <w:left w:val="nil"/>
+              <w:bottom w:val="nil"/>
+              <w:right w:val="nil"/>
+            </w:tcBorders>
+            <w:hideMark/>
+          </w:tcPr>
+          <w:p>
+            <w:pPr>
+              <w:suppressAutoHyphens w:val="0"/>
+              <w:rPr>
+                <w:rFonts w:ascii="Aptos Narrow" w:hAnsi="Aptos Narrow"/>
+                <w:color w:val="000000"/>
+                <w:lang w:val="en-IN" w:eastAsia="en-GB"/>
+              </w:rPr>
+            </w:pPr>
+            <w:r>
+              <w:rPr>
+                <w:rFonts w:ascii="Aptos Narrow" w:hAnsi="Aptos Narrow"/>
+                <w:color w:val="000000"/>
+                <w:lang w:val="en-IN" w:eastAsia="en-GB"/>
+              </w:rPr>
+              <w:t>Copy of Administrative sanction</w:t>
+            </w:r>
+            <w:r>
+              <w:rPr>
+                <w:rFonts w:ascii="Aptos Narrow" w:hAnsi="Aptos Narrow"/>
+                <w:color w:val="000000"/>
+                <w:lang w:val="en-IN" w:eastAsia="en-GB"/>
+              </w:rPr>
+              <w:br/>
+              <w:t>and Tender Approval</w:t>
+            </w:r>
+          </w:p>
+        </w:tc>
+        <w:tc>
+          <w:tcPr>
+            <w:tcW w:w="358" w:type="dxa"/>
+            <w:tcBorders>
+              <w:top w:val="nil"/>
+              <w:left w:val="nil"/>
+              <w:bottom w:val="nil"/>
+              <w:right w:val="nil"/>
+            </w:tcBorders>
+            <w:noWrap/>
+            <w:hideMark/>
+          </w:tcPr>
+          <w:p>
+            <w:pPr>
+              <w:suppressAutoHyphens w:val="0"/>
+              <w:rPr>
+                <w:rFonts w:ascii="Aptos Narrow" w:hAnsi="Aptos Narrow"/>
+                <w:color w:val="000000"/>
+                <w:lang w:val="en-IN" w:eastAsia="en-GB"/>
+              </w:rPr>
+            </w:pPr>
+            <w:r>
+              <w:rPr>
+                <w:rFonts w:ascii="Aptos Narrow" w:hAnsi="Aptos Narrow"/>
+                <w:color w:val="000000"/>
+                <w:lang w:val="en-IN" w:eastAsia="en-GB"/>
+              </w:rPr>
+              <w:t>:</w:t>
+            </w:r>
+          </w:p>
+        </w:tc>
+        <w:tc>
+          <w:tcPr>
+            <w:tcW w:w="4836" w:type="dxa"/>
+            <w:tcBorders>
+              <w:top w:val="nil"/>
+              <w:left w:val="nil"/>
+              <w:bottom w:val="nil"/>
+              <w:right w:val="nil"/>
+            </w:tcBorders>
+            <w:noWrap/>
+            <w:hideMark/>
+          </w:tcPr>
+          <w:p>
+            <w:pPr>
+              <w:suppressAutoHyphens w:val="0"/>
+              <w:rPr>
+                <w:rFonts w:ascii="Aptos Narrow" w:hAnsi="Aptos Narrow"/>
+                <w:color w:val="000000"/>
+                <w:lang w:val="en-IN" w:eastAsia="en-GB"/>
+              </w:rPr>
+            </w:pPr>
+          </w:p>
+        </w:tc>
+      </w:tr>
+      <w:tr>
+        <w:trPr>
+          <w:trHeight w:val="327"/>
+        </w:trPr>
+        <w:tc>
+          <w:tcPr>
+            <w:tcW w:w="378" w:type="dxa"/>
+            <w:tcBorders>
+              <w:top w:val="nil"/>
+              <w:left w:val="nil"/>
+              <w:bottom w:val="nil"/>
+              <w:right w:val="nil"/>
+            </w:tcBorders>
+            <w:noWrap/>
+            <w:hideMark/>
+          </w:tcPr>
+          <w:p>
+            <w:pPr>
+              <w:suppressAutoHyphens w:val="0"/>
+              <w:jc w:val="right"/>
+              <w:rPr>
+                <w:rFonts w:ascii="Aptos Narrow" w:hAnsi="Aptos Narrow"/>
+                <w:color w:val="000000"/>
+                <w:lang w:val="en-IN" w:eastAsia="en-GB"/>
+              </w:rPr>
+            </w:pPr>
+            <w:r>
+              <w:rPr>
+                <w:rFonts w:ascii="Aptos Narrow" w:hAnsi="Aptos Narrow"/>
+                <w:color w:val="000000"/>
+                <w:lang w:val="en-IN" w:eastAsia="en-GB"/>
+              </w:rPr>
+              <w:t>4</w:t>
+            </w:r>
+          </w:p>
+        </w:tc>
+        <w:tc>
+          <w:tcPr>
+            <w:tcW w:w="4075" w:type="dxa"/>
+            <w:tcBorders>
+              <w:top w:val="nil"/>
+              <w:left w:val="nil"/>
+              <w:bottom w:val="nil"/>
+              <w:right w:val="nil"/>
+            </w:tcBorders>
+            <w:noWrap/>
+            <w:hideMark/>
+          </w:tcPr>
+          <w:p>
+            <w:pPr>
+              <w:suppressAutoHyphens w:val="0"/>
+              <w:rPr>
+                <w:rFonts w:ascii="Aptos Narrow" w:hAnsi="Aptos Narrow"/>
+                <w:color w:val="000000"/>
+                <w:lang w:val="en-IN" w:eastAsia="en-GB"/>
+              </w:rPr>
+            </w:pPr>
+            <w:r>
+              <w:rPr>
+                <w:rFonts w:ascii="Aptos Narrow" w:hAnsi="Aptos Narrow"/>
+                <w:color w:val="000000"/>
+                <w:lang w:val="en-IN" w:eastAsia="en-GB"/>
+              </w:rPr>
+              <w:t xml:space="preserve">Copy of Estimate </w:t>
+            </w:r>
+          </w:p>
+        </w:tc>
+        <w:tc>
+          <w:tcPr>
+            <w:tcW w:w="358" w:type="dxa"/>
+            <w:tcBorders>
+              <w:top w:val="nil"/>
+              <w:left w:val="nil"/>
+              <w:bottom w:val="nil"/>
+              <w:right w:val="nil"/>
+            </w:tcBorders>
+            <w:noWrap/>
+            <w:hideMark/>
+          </w:tcPr>
+          <w:p>
+            <w:pPr>
+              <w:suppressAutoHyphens w:val="0"/>
+              <w:rPr>
+                <w:rFonts w:ascii="Aptos Narrow" w:hAnsi="Aptos Narrow"/>
+                <w:color w:val="000000"/>
+                <w:lang w:val="en-IN" w:eastAsia="en-GB"/>
+              </w:rPr>
+            </w:pPr>
+            <w:r>
+              <w:rPr>
+                <w:rFonts w:ascii="Aptos Narrow" w:hAnsi="Aptos Narrow"/>
+                <w:color w:val="000000"/>
+                <w:lang w:val="en-IN" w:eastAsia="en-GB"/>
+              </w:rPr>
+              <w:t>:</w:t>
+            </w:r>
+          </w:p>
+        </w:tc>
+        <w:tc>
+          <w:tcPr>
+            <w:tcW w:w="4836" w:type="dxa"/>
+            <w:tcBorders>
+              <w:top w:val="nil"/>
+              <w:left w:val="nil"/>
+              <w:bottom w:val="nil"/>
+              <w:right w:val="nil"/>
+            </w:tcBorders>
+            <w:noWrap/>
+            <w:hideMark/>
+          </w:tcPr>
+          <w:p>
+            <w:pPr>
+              <w:suppressAutoHyphens w:val="0"/>
+              <w:rPr>
+                <w:rFonts w:ascii="Aptos Narrow" w:hAnsi="Aptos Narrow"/>
+                <w:color w:val="000000"/>
+                <w:lang w:val="en-IN" w:eastAsia="en-GB"/>
+              </w:rPr>
+            </w:pPr>
+          </w:p>
+        </w:tc>
+      </w:tr>
+      <w:tr>
+        <w:trPr>
+          <w:trHeight w:val="1125"/>
+        </w:trPr>
+        <w:tc>
+          <w:tcPr>
+            <w:tcW w:w="378" w:type="dxa"/>
+            <w:tcBorders>
+              <w:top w:val="nil"/>
+              <w:left w:val="nil"/>
+              <w:bottom w:val="nil"/>
+              <w:right w:val="nil"/>
+            </w:tcBorders>
+            <w:noWrap/>
+            <w:hideMark/>
+          </w:tcPr>
+          <w:p>
+            <w:pPr>
+              <w:suppressAutoHyphens w:val="0"/>
+              <w:jc w:val="right"/>
+              <w:rPr>
+                <w:rFonts w:ascii="Aptos Narrow" w:hAnsi="Aptos Narrow"/>
+                <w:color w:val="000000"/>
+                <w:lang w:val="en-IN" w:eastAsia="en-GB"/>
+              </w:rPr>
+            </w:pPr>
+            <w:r>
+              <w:rPr>
+                <w:rFonts w:ascii="Aptos Narrow" w:hAnsi="Aptos Narrow"/>
+                <w:color w:val="000000"/>
+                <w:lang w:val="en-IN" w:eastAsia="en-GB"/>
+              </w:rPr>
+              <w:t>5</w:t>
+            </w:r>
+          </w:p>
+        </w:tc>
+        <w:tc>
+          <w:tcPr>
+            <w:tcW w:w="4075" w:type="dxa"/>
+            <w:tcBorders>
+              <w:top w:val="nil"/>
+              <w:left w:val="nil"/>
+              <w:bottom w:val="nil"/>
+              <w:right w:val="nil"/>
+            </w:tcBorders>
+            <w:noWrap/>
+            <w:hideMark/>
+          </w:tcPr>
+          <w:p>
+            <w:pPr>
+              <w:suppressAutoHyphens w:val="0"/>
+              <w:rPr>
+                <w:rFonts w:ascii="Aptos Narrow" w:hAnsi="Aptos Narrow"/>
+                <w:color w:val="000000"/>
+                <w:lang w:val="en-IN" w:eastAsia="en-GB"/>
+              </w:rPr>
+            </w:pPr>
+            <w:r>
+              <w:rPr>
+                <w:rFonts w:ascii="Aptos Narrow" w:hAnsi="Aptos Narrow"/>
+                <w:color w:val="000000"/>
+                <w:lang w:val="en-IN" w:eastAsia="en-GB"/>
+              </w:rPr>
+              <w:t xml:space="preserve">EMD details </w:t>
+            </w:r>
+          </w:p>
+        </w:tc>
+        <w:tc>
+          <w:tcPr>
+            <w:tcW w:w="358" w:type="dxa"/>
+            <w:tcBorders>
+              <w:top w:val="nil"/>
+              <w:left w:val="nil"/>
+              <w:bottom w:val="nil"/>
+              <w:right w:val="nil"/>
+            </w:tcBorders>
+            <w:noWrap/>
+            <w:hideMark/>
+          </w:tcPr>
+          <w:p>
+            <w:pPr>
+              <w:suppressAutoHyphens w:val="0"/>
+              <w:rPr>
+                <w:rFonts w:ascii="Aptos Narrow" w:hAnsi="Aptos Narrow"/>
+                <w:color w:val="000000"/>
+                <w:lang w:val="en-IN" w:eastAsia="en-GB"/>
+              </w:rPr>
+            </w:pPr>
+            <w:r>
+              <w:rPr>
+                <w:rFonts w:ascii="Aptos Narrow" w:hAnsi="Aptos Narrow"/>
+                <w:color w:val="000000"/>
+                <w:lang w:val="en-IN" w:eastAsia="en-GB"/>
+              </w:rPr>
+              <w:t>:</w:t>
+            </w:r>
+          </w:p>
+        </w:tc>
+        <w:tc>
+          <w:tcPr>
+            <w:tcW w:w="4836" w:type="dxa"/>
+            <w:tcBorders>
+              <w:top w:val="nil"/>
+              <w:left w:val="nil"/>
+              <w:bottom w:val="nil"/>
+              <w:right w:val="nil"/>
+            </w:tcBorders>
+            <w:hideMark/>
+          </w:tcPr>
+          <w:p>
+            <w:pPr>
+              <w:suppressAutoHyphens w:val="0"/>
+              <w:rPr>
+                <w:rFonts w:ascii="Aptos Narrow" w:hAnsi="Aptos Narrow"/>
+                <w:color w:val="000000"/>
+                <w:lang w:val="en-IN" w:eastAsia="en-GB"/>
+              </w:rPr>
+            </w:pPr>
+            <w:r>
+              <w:rPr>
+                <w:rFonts w:ascii="Aptos Narrow" w:hAnsi="Aptos Narrow"/>
+                <w:color w:val="000000"/>
+                <w:lang w:val="en-IN" w:eastAsia="en-GB"/>
+              </w:rPr>
+              <w:t xml:space="preserve">______________________________</w:t>
+              <w:br/>
+              <w:t xml:space="preserve">______________________________</w:t>
+              <w:br/>
+              <w:t xml:space="preserve">______________________________</w:t>
+            </w:r>
+          </w:p>
+        </w:tc>
+      </w:tr>
+    </w:tbl>
     <w:p>
       <w:pPr>
         <w:pStyle w:val="Normal"/>
@@ -405,246 +1142,13 @@
         <w:rPr>
           <w:rFonts w:cs="Book Antiqua" w:ascii="Book Antiqua" w:hAnsi="Book Antiqua"/>
         </w:rPr>
-        <w:t xml:space="preserve">1)</w:t>
-        <w:tab/>
-        <w:t xml:space="preserve">Original Agreement Bond No.</w:t>
-        <w:tab/>
-        <w:t xml:space="preserve"> :     /SE/{{ZoneAbbr}}/{{Corp}}/{{FY}}/  Date :          -2026 </w:t>
-      </w:r>
-    </w:p>
-    <w:p>
-      <w:pPr>
-        <w:pStyle w:val="Heading3"/>
-        <w:ind w:hanging="0" w:start="0"/>
-        <w:rPr>
-          <w:rFonts w:ascii="Book Antiqua" w:hAnsi="Book Antiqua" w:cs="Book Antiqua"/>
-          <w:b w:val="false"/>
-          <w:bCs w:val="false"/>
-          <w:sz w:val="16"/>
-        </w:rPr>
-      </w:pPr>
-      <w:r>
-        <w:rPr>
-          <w:rFonts w:cs="Book Antiqua" w:ascii="Book Antiqua" w:hAnsi="Book Antiqua"/>
-          <w:b w:val="false"/>
-          <w:bCs w:val="false"/>
-          <w:sz w:val="16"/>
-        </w:rPr>
-      </w:r>
-    </w:p>
-    <w:p>
-      <w:pPr>
-        <w:pStyle w:val="Normal"/>
-        <w:rPr>
-          <w:sz w:val="14"/>
-        </w:rPr>
-      </w:pPr>
-      <w:r>
-        <w:rPr>
-          <w:rFonts w:cs="Book Antiqua" w:ascii="Book Antiqua" w:hAnsi="Book Antiqua"/>
-          <w:b/>
-          <w:bCs/>
-          <w:sz w:val="14"/>
-        </w:rPr>
-      </w:r>
-    </w:p>
-    <w:p>
-      <w:pPr>
-        <w:pStyle w:val="Header"/>
-        <w:ind w:hanging="720" w:start="702" w:end="0"/>
-        <w:jc w:val="both"/>
-        <w:rPr>
-          <w:b/>
-          <w:sz w:val="22"/>
-          <w:szCs w:val="22"/>
-        </w:rPr>
-      </w:pPr>
-      <w:r>
-        <w:rPr>
-          <w:bCs/>
-        </w:rPr>
-        <w:t xml:space="preserve">2)</w:t>
-        <w:tab/>
-        <w:t xml:space="preserve">Original Agreement Bond of    </w:t>
-        <w:tab/>
-        <w:t xml:space="preserve"> :              {{Agency Name}},</w:t>
-      </w:r>
-    </w:p>
-    <w:p>
-      <w:pPr>
-        <w:pStyle w:val="Default"/>
-        <w:ind w:left="4320"/>
-        <w:rPr>
-          <w:rFonts w:ascii="Times New Roman" w:hAnsi="Times New Roman" w:cs="Times New Roman"/>
-          <w:b/>
-          <w:bCs/>
-          <w:color w:val="000000"/>
-          <w:sz w:val="22"/>
-          <w:szCs w:val="22"/>
-        </w:rPr>
-      </w:pPr>
-      <w:r>
-        <w:rPr>
-          <w:rFonts w:cs="Times New Roman" w:ascii="Times New Roman" w:hAnsi="Times New Roman"/>
-          <w:b/>
-          <w:bCs/>
-          <w:color w:val="000000"/>
-          <w:sz w:val="22"/>
-          <w:szCs w:val="22"/>
-        </w:rPr>
-        <w:t>{{Agency Address}}</w:t>
-      </w:r>
-    </w:p>
-    <w:p>
-      <w:pPr>
-        <w:pStyle w:val="Normal"/>
-        <w:ind w:left="4320"/>
-        <w:rPr>
-          <w:b/>
-          <w:sz w:val="22"/>
-          <w:szCs w:val="22"/>
-        </w:rPr>
-      </w:pPr>
-      <w:r>
-        <w:rPr>
-          <w:b/>
-          <w:bCs/>
-          <w:sz w:val="22"/>
-          <w:szCs w:val="22"/>
-        </w:rPr>
-        <w:t xml:space="preserve">Ph: {{Agency Phone}}</w:t>
-      </w:r>
-    </w:p>
-    <w:p>
-      <w:pPr>
-        <w:pStyle w:val="Normal"/>
-        <w:rPr/>
-      </w:pPr>
-      <w:r>
-        <w:rPr>
-          <w:b/>
-          <w:sz w:val="22"/>
-          <w:szCs w:val="22"/>
-        </w:rPr>
-      </w:r>
-    </w:p>
-    <w:p>
-      <w:pPr>
-        <w:pStyle w:val="Normal"/>
-        <w:rPr/>
-      </w:pPr>
-      <w:r>
-        <w:rPr/>
-        <w:tab/>
-      </w:r>
-    </w:p>
-    <w:p>
-      <w:pPr>
-        <w:pStyle w:val="Normal"/>
-        <w:jc w:val="both"/>
-        <w:rPr>
-          <w:rFonts w:ascii="Book Antiqua" w:hAnsi="Book Antiqua" w:cs="Book Antiqua"/>
-        </w:rPr>
-      </w:pPr>
-      <w:r>
-        <w:rPr>
-          <w:rFonts w:cs="Book Antiqua" w:ascii="Book Antiqua" w:hAnsi="Book Antiqua"/>
-        </w:rPr>
-        <w:t>3)</w:t>
-        <w:tab/>
-        <w:t>Copy of Administrative sanction</w:t>
-        <w:tab/>
-        <w:t>:</w:t>
-        <w:tab/>
-        <w:t>(     ) Pages</w:t>
-      </w:r>
-    </w:p>
-    <w:p>
-      <w:pPr>
-        <w:pStyle w:val="Normal"/>
-        <w:jc w:val="both"/>
-        <w:rPr>
-          <w:rFonts w:ascii="Book Antiqua" w:hAnsi="Book Antiqua" w:cs="Book Antiqua"/>
-        </w:rPr>
-      </w:pPr>
-      <w:r>
-        <w:rPr>
-          <w:rFonts w:cs="Book Antiqua" w:ascii="Book Antiqua" w:hAnsi="Book Antiqua"/>
-        </w:rPr>
-        <w:tab/>
-        <w:t>and Tender Approval</w:t>
-      </w:r>
-    </w:p>
-    <w:p>
-      <w:pPr>
-        <w:pStyle w:val="Normal"/>
-        <w:jc w:val="both"/>
-        <w:rPr>
-          <w:rFonts w:ascii="Book Antiqua" w:hAnsi="Book Antiqua" w:cs="Book Antiqua"/>
-          <w:sz w:val="16"/>
-        </w:rPr>
-      </w:pPr>
-      <w:r>
-        <w:rPr>
-          <w:rFonts w:cs="Book Antiqua" w:ascii="Book Antiqua" w:hAnsi="Book Antiqua"/>
-          <w:sz w:val="16"/>
-        </w:rPr>
-      </w:r>
-    </w:p>
-    <w:p>
-      <w:pPr>
-        <w:pStyle w:val="Normal"/>
-        <w:jc w:val="both"/>
-        <w:rPr>
-          <w:rFonts w:ascii="Book Antiqua" w:hAnsi="Book Antiqua" w:cs="Book Antiqua"/>
-        </w:rPr>
-      </w:pPr>
-      <w:r>
-        <w:rPr>
-          <w:rFonts w:cs="Book Antiqua" w:ascii="Book Antiqua" w:hAnsi="Book Antiqua"/>
-        </w:rPr>
-        <w:t>4)</w:t>
-        <w:tab/>
-        <w:t>Copy of Estimate</w:t>
         <w:tab/>
         <w:tab/>
         <w:tab/>
-        <w:t xml:space="preserve">: </w:t>
         <w:tab/>
-        <w:t>(     ) Pages</w:t>
-      </w:r>
-    </w:p>
-    <w:p>
-      <w:pPr>
-        <w:pStyle w:val="Normal"/>
-        <w:jc w:val="both"/>
-        <w:rPr>
-          <w:rFonts w:ascii="Book Antiqua" w:hAnsi="Book Antiqua" w:cs="Book Antiqua"/>
-          <w:sz w:val="16"/>
-        </w:rPr>
-      </w:pPr>
-      <w:r>
-        <w:rPr>
-          <w:rFonts w:cs="Book Antiqua" w:ascii="Book Antiqua" w:hAnsi="Book Antiqua"/>
-          <w:sz w:val="16"/>
-        </w:rPr>
-      </w:r>
-    </w:p>
-    <w:p>
-      <w:pPr>
-        <w:pStyle w:val="Normal"/>
-        <w:jc w:val="both"/>
-        <w:rPr>
-          <w:rFonts w:ascii="Book Antiqua" w:hAnsi="Book Antiqua" w:cs="Book Antiqua"/>
-          <w:b/>
-          <w:bCs/>
-        </w:rPr>
-      </w:pPr>
-      <w:r>
-        <w:rPr>
-          <w:rFonts w:cs="Book Antiqua" w:ascii="Book Antiqua" w:hAnsi="Book Antiqua"/>
-        </w:rPr>
-        <w:t xml:space="preserve">5) EMD details : EMD 1.5% Online payment Rs.{{EMD 1.5%}},  Receipt No: {{EMD Receipt No}}  Dt. {{EMD Receipt Date}}  EMD 1% Rs.{{EMD 1%}}          Payment ID: __________,  Gate ID / UTR No.: __________,  Dt: __________,  EMD 1% transferred to {{Corp}} Collection account on Dt: __________,  CMS ______________</w:t>
+        <w:tab/>
+        <w:tab/>
+        <w:t xml:space="preserve">______________________________________________</w:t>
       </w:r>
     </w:p>
     <w:p>
@@ -796,7 +1300,15 @@
           <w:b/>
           <w:lang w:val="en-AU"/>
         </w:rPr>
-        <w:t xml:space="preserve">                 {{Zone}} Zone, {{Corp}}</w:t>
+        <w:t xml:space="preserve">                 </w:t>
+      </w:r>
+      <w:r>
+        <w:rPr>
+          <w:rFonts w:cs="Book Antiqua" w:ascii="Book Antiqua" w:hAnsi="Book Antiqua"/>
+          <w:b/>
+          <w:lang w:val="en-AU"/>
+        </w:rPr>
+        <w:t>{{Zone}} Zone, {{Corp}}</w:t>
       </w:r>
     </w:p>
     <w:p>
@@ -1331,22 +1843,6 @@
       <w:szCs w:val="20"/>
     </w:rPr>
   </w:style>
-  <w:style w:type="paragraph" w:styleId="Default">
-    <w:name w:val="Default"/>
-    <w:qFormat/>
-    <w:pPr>
-      <w:widowControl/>
-      <w:autoSpaceDE w:val="false"/>
-      <w:bidi w:val="0"/>
-    </w:pPr>
-    <w:rPr>
-      <w:rFonts w:ascii="Segoe UI" w:hAnsi="Segoe UI" w:eastAsia="Times New Roman" w:cs="Segoe UI"/>
-      <w:color w:val="000000"/>
-      <w:sz w:val="24"/>
-      <w:szCs w:val="24"/>
-      <w:lang w:val="en-US" w:bidi="ar-SA" w:eastAsia="zh-CN"/>
-    </w:rPr>
-  </w:style>
 </w:styles>
 </file>
 

</xml_diff>